<commit_message>
docs: onboarding namespaces get their labels from the template
The two labels are set by the platform's namespace-creation template, not
written by the developer: the guide's step 3 now says the request gives the
mnemonic and each namespace's environment and the template sets the
labels, and step 4 and the checklist add a check that each namespace's
page shows the values asked for. Word file rebuilt.
</commit_message>
<xml_diff>
--- a/docs/ONBOARDING.docx
+++ b/docs/ONBOARDING.docx
@@ -1366,7 +1366,19 @@
         <w:pStyle w:val="FirstParagraph"/>
       </w:pPr>
       <w:r>
-        <w:t xml:space="preserve">Every namespace you ask for belongs to one environment and carries both labels:</w:t>
+        <w:t xml:space="preserve">Namespaces are created from the platform's namespace template, and the template sets both labels on every</w:t>
+      </w:r>
+      <w:r>
+        <w:t xml:space="preserve"> </w:t>
+      </w:r>
+      <w:r>
+        <w:t xml:space="preserve">namespace. You do not write them: in your request you give your mnemonic and, for each namespace, its environment, and</w:t>
+      </w:r>
+      <w:r>
+        <w:t xml:space="preserve"> </w:t>
+      </w:r>
+      <w:r>
+        <w:t xml:space="preserve">the template turns them into:</w:t>
       </w:r>
     </w:p>
     <w:p>
@@ -1706,7 +1718,7 @@
         <w:pStyle w:val="FirstParagraph"/>
       </w:pPr>
       <w:r>
-        <w:t xml:space="preserve">The environment value is exactly</w:t>
+        <w:t xml:space="preserve">Give the environment exactly as</w:t>
       </w:r>
       <w:r>
         <w:t xml:space="preserve"> </w:t>
@@ -1757,7 +1769,13 @@
         <w:t xml:space="preserve">prod</w:t>
       </w:r>
       <w:r>
-        <w:t xml:space="preserve">, in lowercase. Any other value, such as</w:t>
+        <w:t xml:space="preserve">, in lowercase, and the mnemonic exactly as in your group</w:t>
+      </w:r>
+      <w:r>
+        <w:t xml:space="preserve"> </w:t>
+      </w:r>
+      <w:r>
+        <w:t xml:space="preserve">names. A label with any other value, such as</w:t>
       </w:r>
       <w:r>
         <w:t xml:space="preserve"> </w:t>
@@ -1796,13 +1814,19 @@
         <w:t xml:space="preserve">Prod</w:t>
       </w:r>
       <w:r>
-        <w:t xml:space="preserve">, gives the namespace no access at all. Put both labels in your namespace request, and access</w:t>
-      </w:r>
-      <w:r>
-        <w:t xml:space="preserve"> </w:t>
-      </w:r>
-      <w:r>
-        <w:t xml:space="preserve">follows from them: you never ask for access to a namespace separately.</w:t>
+        <w:t xml:space="preserve">, gives the namespace no access at all, so</w:t>
+      </w:r>
+      <w:r>
+        <w:t xml:space="preserve"> </w:t>
+      </w:r>
+      <w:r>
+        <w:t xml:space="preserve">check both labels once the namespace exists (step 4). Access follows from the labels: you never ask for access to a</w:t>
+      </w:r>
+      <w:r>
+        <w:t xml:space="preserve"> </w:t>
+      </w:r>
+      <w:r>
+        <w:t xml:space="preserve">namespace separately.</w:t>
       </w:r>
     </w:p>
     <w:p>
@@ -1919,7 +1943,13 @@
         <w:t xml:space="preserve"> </w:t>
       </w:r>
       <w:r>
-        <w:t xml:space="preserve">labels it carries and, under</w:t>
+        <w:t xml:space="preserve">labels the template set (check</w:t>
+      </w:r>
+      <w:r>
+        <w:t xml:space="preserve"> </w:t>
+      </w:r>
+      <w:r>
+        <w:t xml:space="preserve">they are the ones you asked for) and, under</w:t>
       </w:r>
       <w:r>
         <w:t xml:space="preserve"> </w:t>
@@ -3111,22 +3141,27 @@
         </w:numPr>
       </w:pPr>
       <w:r>
-        <w:t xml:space="preserve">Every namespace I ask for has</w:t>
-      </w:r>
-      <w:r>
-        <w:t xml:space="preserve"> </w:t>
-      </w:r>
-      <w:r>
-        <w:rPr>
-          <w:rStyle w:val="VerbatimChar"/>
-        </w:rPr>
-        <w:t xml:space="preserve">company.net/mnemonic</w:t>
-      </w:r>
-      <w:r>
-        <w:t xml:space="preserve"> </w:t>
-      </w:r>
-      <w:r>
-        <w:t xml:space="preserve">set to my mnemonic. (</w:t>
+        <w:t xml:space="preserve">My namespace request gives my mnemonic, the same three letters as in the group names.</w:t>
+      </w:r>
+      <w:r>
+        <w:t xml:space="preserve"> </w:t>
+      </w:r>
+      <w:r>
+        <w:t xml:space="preserve">(</w:t>
+      </w:r>
+      <w:hyperlink w:anchor="_38acef848ce29405352518279f38563d145ffea">
+        <w:r>
+          <w:rPr>
+            <w:rStyle w:val="Hyperlink"/>
+          </w:rPr>
+          <w:t xml:space="preserve">§2</w:t>
+        </w:r>
+      </w:hyperlink>
+      <w:r>
+        <w:t xml:space="preserve">,</w:t>
+      </w:r>
+      <w:r>
+        <w:t xml:space="preserve"> </w:t>
       </w:r>
       <w:hyperlink w:anchor="_a7ee87f8ca21c9f7beb94ebcee9b501342447dc">
         <w:r>
@@ -3149,7 +3184,79 @@
         </w:numPr>
       </w:pPr>
       <w:r>
-        <w:t xml:space="preserve">Every namespace has</w:t>
+        <w:t xml:space="preserve">It gives each namespace's environment as exactly</w:t>
+      </w:r>
+      <w:r>
+        <w:t xml:space="preserve"> </w:t>
+      </w:r>
+      <w:r>
+        <w:rPr>
+          <w:rStyle w:val="VerbatimChar"/>
+        </w:rPr>
+        <w:t xml:space="preserve">rnd</w:t>
+      </w:r>
+      <w:r>
+        <w:t xml:space="preserve">,</w:t>
+      </w:r>
+      <w:r>
+        <w:t xml:space="preserve"> </w:t>
+      </w:r>
+      <w:r>
+        <w:rPr>
+          <w:rStyle w:val="VerbatimChar"/>
+        </w:rPr>
+        <w:t xml:space="preserve">qa</w:t>
+      </w:r>
+      <w:r>
+        <w:t xml:space="preserve">,</w:t>
+      </w:r>
+      <w:r>
+        <w:t xml:space="preserve"> </w:t>
+      </w:r>
+      <w:r>
+        <w:rPr>
+          <w:rStyle w:val="VerbatimChar"/>
+        </w:rPr>
+        <w:t xml:space="preserve">uat</w:t>
+      </w:r>
+      <w:r>
+        <w:t xml:space="preserve"> </w:t>
+      </w:r>
+      <w:r>
+        <w:t xml:space="preserve">or</w:t>
+      </w:r>
+      <w:r>
+        <w:t xml:space="preserve"> </w:t>
+      </w:r>
+      <w:r>
+        <w:rPr>
+          <w:rStyle w:val="VerbatimChar"/>
+        </w:rPr>
+        <w:t xml:space="preserve">prod</w:t>
+      </w:r>
+      <w:r>
+        <w:t xml:space="preserve">; the namespace template turns</w:t>
+      </w:r>
+      <w:r>
+        <w:t xml:space="preserve"> </w:t>
+      </w:r>
+      <w:r>
+        <w:t xml:space="preserve">these into the</w:t>
+      </w:r>
+      <w:r>
+        <w:t xml:space="preserve"> </w:t>
+      </w:r>
+      <w:r>
+        <w:rPr>
+          <w:rStyle w:val="VerbatimChar"/>
+        </w:rPr>
+        <w:t xml:space="preserve">company.net/mnemonic</w:t>
+      </w:r>
+      <w:r>
+        <w:t xml:space="preserve"> </w:t>
+      </w:r>
+      <w:r>
+        <w:t xml:space="preserve">and</w:t>
       </w:r>
       <w:r>
         <w:t xml:space="preserve"> </w:t>
@@ -3164,58 +3271,7 @@
         <w:t xml:space="preserve"> </w:t>
       </w:r>
       <w:r>
-        <w:t xml:space="preserve">set to exactly</w:t>
-      </w:r>
-      <w:r>
-        <w:t xml:space="preserve"> </w:t>
-      </w:r>
-      <w:r>
-        <w:rPr>
-          <w:rStyle w:val="VerbatimChar"/>
-        </w:rPr>
-        <w:t xml:space="preserve">rnd</w:t>
-      </w:r>
-      <w:r>
-        <w:t xml:space="preserve">,</w:t>
-      </w:r>
-      <w:r>
-        <w:t xml:space="preserve"> </w:t>
-      </w:r>
-      <w:r>
-        <w:rPr>
-          <w:rStyle w:val="VerbatimChar"/>
-        </w:rPr>
-        <w:t xml:space="preserve">qa</w:t>
-      </w:r>
-      <w:r>
-        <w:t xml:space="preserve">,</w:t>
-      </w:r>
-      <w:r>
-        <w:t xml:space="preserve"> </w:t>
-      </w:r>
-      <w:r>
-        <w:rPr>
-          <w:rStyle w:val="VerbatimChar"/>
-        </w:rPr>
-        <w:t xml:space="preserve">uat</w:t>
-      </w:r>
-      <w:r>
-        <w:t xml:space="preserve"> </w:t>
-      </w:r>
-      <w:r>
-        <w:t xml:space="preserve">or</w:t>
-      </w:r>
-      <w:r>
-        <w:t xml:space="preserve"> </w:t>
-      </w:r>
-      <w:r>
-        <w:rPr>
-          <w:rStyle w:val="VerbatimChar"/>
-        </w:rPr>
-        <w:t xml:space="preserve">prod</w:t>
-      </w:r>
-      <w:r>
-        <w:t xml:space="preserve">.</w:t>
+        <w:t xml:space="preserve">labels.</w:t>
       </w:r>
       <w:r>
         <w:t xml:space="preserve"> </w:t>
@@ -3237,6 +3293,16 @@
     </w:p>
     <w:p>
       <w:pPr>
+        <w:pStyle w:val="Heading2"/>
+      </w:pPr>
+      <w:bookmarkStart w:id="21" w:name="_59e09b91ea0fcd4db92ec885cac713d44983e62"/>
+      <w:r>
+        <w:t xml:space="preserve">After the namespaces exist</w:t>
+      </w:r>
+      <w:bookmarkEnd w:id="21"/>
+    </w:p>
+    <w:p>
+      <w:pPr>
         <w:pStyle w:val="Compact"/>
         <w:numPr>
           <w:ilvl w:val="0"/>
@@ -3244,29 +3310,55 @@
         </w:numPr>
       </w:pPr>
       <w:r>
-        <w:t xml:space="preserve">The mnemonic on the namespaces is the same three letters as in the group names. (</w:t>
-      </w:r>
-      <w:hyperlink w:anchor="_38acef848ce29405352518279f38563d145ffea">
+        <w:t xml:space="preserve">Each namespace's page in the dashboard shows the</w:t>
+      </w:r>
+      <w:r>
+        <w:t xml:space="preserve"> </w:t>
+      </w:r>
+      <w:r>
+        <w:rPr>
+          <w:rStyle w:val="VerbatimChar"/>
+        </w:rPr>
+        <w:t xml:space="preserve">mnemonic</w:t>
+      </w:r>
+      <w:r>
+        <w:t xml:space="preserve"> </w:t>
+      </w:r>
+      <w:r>
+        <w:t xml:space="preserve">and</w:t>
+      </w:r>
+      <w:r>
+        <w:t xml:space="preserve"> </w:t>
+      </w:r>
+      <w:r>
+        <w:rPr>
+          <w:rStyle w:val="VerbatimChar"/>
+        </w:rPr>
+        <w:t xml:space="preserve">app-environment</w:t>
+      </w:r>
+      <w:r>
+        <w:t xml:space="preserve"> </w:t>
+      </w:r>
+      <w:r>
+        <w:t xml:space="preserve">I asked for.</w:t>
+      </w:r>
+      <w:r>
+        <w:t xml:space="preserve"> </w:t>
+      </w:r>
+      <w:r>
+        <w:t xml:space="preserve">(</w:t>
+      </w:r>
+      <w:hyperlink w:anchor="_e0a9a022dcb86ac8b9b6eaeb72aa241b8ab640b">
         <w:r>
           <w:rPr>
             <w:rStyle w:val="Hyperlink"/>
           </w:rPr>
-          <w:t xml:space="preserve">§2</w:t>
+          <w:t xml:space="preserve">§6</w:t>
         </w:r>
       </w:hyperlink>
       <w:r>
         <w:t xml:space="preserve">)</w:t>
       </w:r>
-    </w:p>
-    <w:p>
-      <w:pPr>
-        <w:pStyle w:val="Heading2"/>
-      </w:pPr>
-      <w:bookmarkStart w:id="21" w:name="_59e09b91ea0fcd4db92ec885cac713d44983e62"/>
-      <w:r>
-        <w:t xml:space="preserve">After the namespaces exist</w:t>
-      </w:r>
-      <w:bookmarkEnd w:id="21"/>
     </w:p>
     <w:p>
       <w:pPr>

</xml_diff>

<commit_message>
docs: new namespaces state the mnemonic; existing ones need only groups
The developer only states the target mnemonic in a namespace request; the
namespace template sets both labels, the environment included. A team
whose namespaces already exist skips the namespace step: it creates the
groups and the mnemonic owner adds its users (their entitlement), and
access follows on the next group sync. Guide, checklist and Word file
re-rendered.
</commit_message>
<xml_diff>
--- a/docs/ONBOARDING.docx
+++ b/docs/ONBOARDING.docx
@@ -94,7 +94,7 @@
               <w:pStyle w:val="Compact"/>
             </w:pPr>
             <w:r>
-              <w:t xml:space="preserve">your application's mnemonic, two directory groups in each environment, and namespaces carrying two labels</w:t>
+              <w:t xml:space="preserve">your application's mnemonic, two directory groups in each environment with your users in them, and namespaces labelled with that mnemonic (the namespace template does it)</w:t>
             </w:r>
           </w:p>
         </w:tc>
@@ -166,7 +166,13 @@
         <w:t xml:space="preserve"> </w:t>
       </w:r>
       <w:r>
-        <w:t xml:space="preserve">place first, then ask for your namespaces. Every example below uses the mnemonic</w:t>
+        <w:t xml:space="preserve">place first, then ask for any new namespaces, stating your mnemonic; if your namespaces already exist, the groups and</w:t>
+      </w:r>
+      <w:r>
+        <w:t xml:space="preserve"> </w:t>
+      </w:r>
+      <w:r>
+        <w:t xml:space="preserve">their members are all you need. Every example below uses the mnemonic</w:t>
       </w:r>
       <w:r>
         <w:t xml:space="preserve"> </w:t>
@@ -1140,7 +1146,13 @@
         <w:pStyle w:val="FirstParagraph"/>
       </w:pPr>
       <w:r>
-        <w:t xml:space="preserve">Put each person only in the groups they need, environment by environment. A developer is usually in the developer</w:t>
+        <w:t xml:space="preserve">Then have the mnemonic owner add your users to the groups (their entitlement). Put each person only in the groups</w:t>
+      </w:r>
+      <w:r>
+        <w:t xml:space="preserve"> </w:t>
+      </w:r>
+      <w:r>
+        <w:t xml:space="preserve">they need, environment by environment. A developer is usually in the developer</w:t>
       </w:r>
       <w:r>
         <w:t xml:space="preserve"> </w:t>
@@ -1366,19 +1378,47 @@
         <w:pStyle w:val="FirstParagraph"/>
       </w:pPr>
       <w:r>
-        <w:t xml:space="preserve">Namespaces are created from the platform's namespace template, and the template sets both labels on every</w:t>
-      </w:r>
-      <w:r>
-        <w:t xml:space="preserve"> </w:t>
-      </w:r>
-      <w:r>
-        <w:t xml:space="preserve">namespace. You do not write them: in your request you give your mnemonic and, for each namespace, its environment, and</w:t>
-      </w:r>
-      <w:r>
-        <w:t xml:space="preserve"> </w:t>
-      </w:r>
-      <w:r>
-        <w:t xml:space="preserve">the template turns them into:</w:t>
+        <w:rPr>
+          <w:b/>
+          <w:bCs/>
+        </w:rPr>
+        <w:t xml:space="preserve">If your application's namespaces already exist,</w:t>
+      </w:r>
+      <w:r>
+        <w:t xml:space="preserve"> </w:t>
+      </w:r>
+      <w:r>
+        <w:t xml:space="preserve">skip this step: they already carry the labels. Once your groups</w:t>
+      </w:r>
+      <w:r>
+        <w:t xml:space="preserve"> </w:t>
+      </w:r>
+      <w:r>
+        <w:t xml:space="preserve">exist and your users are in them (step 1), access follows on the next group sync; go to step 4.</w:t>
+      </w:r>
+    </w:p>
+    <w:p>
+      <w:pPr>
+        <w:pStyle w:val="BodyText"/>
+      </w:pPr>
+      <w:r>
+        <w:rPr>
+          <w:b/>
+          <w:bCs/>
+        </w:rPr>
+        <w:t xml:space="preserve">For a new namespace,</w:t>
+      </w:r>
+      <w:r>
+        <w:t xml:space="preserve"> </w:t>
+      </w:r>
+      <w:r>
+        <w:t xml:space="preserve">state your target mnemonic in the namespace request; that is all you add. Namespaces are</w:t>
+      </w:r>
+      <w:r>
+        <w:t xml:space="preserve"> </w:t>
+      </w:r>
+      <w:r>
+        <w:t xml:space="preserve">created from the platform's namespace template, which sets both labels on every namespace:</w:t>
       </w:r>
     </w:p>
     <w:p>
@@ -1443,7 +1483,7 @@
         <w:rPr>
           <w:rStyle w:val="AttributeTok"/>
         </w:rPr>
-        <w:t xml:space="preserve"> pay          # your mnemonic, exactly as in the group names</w:t>
+        <w:t xml:space="preserve"> pay          # your target mnemonic, as stated in the request</w:t>
       </w:r>
       <w:r>
         <w:br/>
@@ -1470,7 +1510,19 @@
         <w:rPr>
           <w:rStyle w:val="AttributeTok"/>
         </w:rPr>
-        <w:t xml:space="preserve"> rnd   # rnd, qa, uat or prod</w:t>
+        <w:t xml:space="preserve"> rnd   # set by the template</w:t>
+      </w:r>
+      <w:r>
+        <w:rPr>
+          <w:rStyle w:val="ErrorTok"/>
+        </w:rPr>
+        <w:t xml:space="preserve">: </w:t>
+      </w:r>
+      <w:r>
+        <w:rPr>
+          <w:rStyle w:val="AttributeTok"/>
+        </w:rPr>
+        <w:t xml:space="preserve">rnd, qa, uat or prod</w:t>
       </w:r>
     </w:p>
     <w:p>
@@ -1718,109 +1770,13 @@
         <w:pStyle w:val="FirstParagraph"/>
       </w:pPr>
       <w:r>
-        <w:t xml:space="preserve">Give the environment exactly as</w:t>
-      </w:r>
-      <w:r>
-        <w:t xml:space="preserve"> </w:t>
-      </w:r>
-      <w:r>
-        <w:rPr>
-          <w:rStyle w:val="VerbatimChar"/>
-        </w:rPr>
-        <w:t xml:space="preserve">rnd</w:t>
-      </w:r>
-      <w:r>
-        <w:t xml:space="preserve">,</w:t>
-      </w:r>
-      <w:r>
-        <w:t xml:space="preserve"> </w:t>
-      </w:r>
-      <w:r>
-        <w:rPr>
-          <w:rStyle w:val="VerbatimChar"/>
-        </w:rPr>
-        <w:t xml:space="preserve">qa</w:t>
-      </w:r>
-      <w:r>
-        <w:t xml:space="preserve">,</w:t>
-      </w:r>
-      <w:r>
-        <w:t xml:space="preserve"> </w:t>
-      </w:r>
-      <w:r>
-        <w:rPr>
-          <w:rStyle w:val="VerbatimChar"/>
-        </w:rPr>
-        <w:t xml:space="preserve">uat</w:t>
-      </w:r>
-      <w:r>
-        <w:t xml:space="preserve"> </w:t>
-      </w:r>
-      <w:r>
-        <w:t xml:space="preserve">or</w:t>
-      </w:r>
-      <w:r>
-        <w:t xml:space="preserve"> </w:t>
-      </w:r>
-      <w:r>
-        <w:rPr>
-          <w:rStyle w:val="VerbatimChar"/>
-        </w:rPr>
-        <w:t xml:space="preserve">prod</w:t>
-      </w:r>
-      <w:r>
-        <w:t xml:space="preserve">, in lowercase, and the mnemonic exactly as in your group</w:t>
-      </w:r>
-      <w:r>
-        <w:t xml:space="preserve"> </w:t>
-      </w:r>
-      <w:r>
-        <w:t xml:space="preserve">names. A label with any other value, such as</w:t>
-      </w:r>
-      <w:r>
-        <w:t xml:space="preserve"> </w:t>
-      </w:r>
-      <w:r>
-        <w:rPr>
-          <w:rStyle w:val="VerbatimChar"/>
-        </w:rPr>
-        <w:t xml:space="preserve">dev</w:t>
-      </w:r>
-      <w:r>
-        <w:t xml:space="preserve">,</w:t>
-      </w:r>
-      <w:r>
-        <w:t xml:space="preserve"> </w:t>
-      </w:r>
-      <w:r>
-        <w:rPr>
-          <w:rStyle w:val="VerbatimChar"/>
-        </w:rPr>
-        <w:t xml:space="preserve">production</w:t>
-      </w:r>
-      <w:r>
-        <w:t xml:space="preserve"> </w:t>
-      </w:r>
-      <w:r>
-        <w:t xml:space="preserve">or</w:t>
-      </w:r>
-      <w:r>
-        <w:t xml:space="preserve"> </w:t>
-      </w:r>
-      <w:r>
-        <w:rPr>
-          <w:rStyle w:val="VerbatimChar"/>
-        </w:rPr>
-        <w:t xml:space="preserve">Prod</w:t>
-      </w:r>
-      <w:r>
-        <w:t xml:space="preserve">, gives the namespace no access at all, so</w:t>
-      </w:r>
-      <w:r>
-        <w:t xml:space="preserve"> </w:t>
-      </w:r>
-      <w:r>
-        <w:t xml:space="preserve">check both labels once the namespace exists (step 4). Access follows from the labels: you never ask for access to a</w:t>
+        <w:t xml:space="preserve">State the mnemonic exactly as it is in your group names. A namespace labelled with another mnemonic gives your groups</w:t>
+      </w:r>
+      <w:r>
+        <w:t xml:space="preserve"> </w:t>
+      </w:r>
+      <w:r>
+        <w:t xml:space="preserve">no access, so check its labels once it exists (step 4). Access follows from the labels: you never ask for access to a</w:t>
       </w:r>
       <w:r>
         <w:t xml:space="preserve"> </w:t>
@@ -1943,13 +1899,13 @@
         <w:t xml:space="preserve"> </w:t>
       </w:r>
       <w:r>
-        <w:t xml:space="preserve">labels the template set (check</w:t>
-      </w:r>
-      <w:r>
-        <w:t xml:space="preserve"> </w:t>
-      </w:r>
-      <w:r>
-        <w:t xml:space="preserve">they are the ones you asked for) and, under</w:t>
+        <w:t xml:space="preserve">labels it carries (check</w:t>
+      </w:r>
+      <w:r>
+        <w:t xml:space="preserve"> </w:t>
+      </w:r>
+      <w:r>
+        <w:t xml:space="preserve">the mnemonic is yours) and, under</w:t>
       </w:r>
       <w:r>
         <w:t xml:space="preserve"> </w:t>
@@ -3126,9 +3082,9 @@
       <w:pPr>
         <w:pStyle w:val="Heading2"/>
       </w:pPr>
-      <w:bookmarkStart w:id="20" w:name="_a1c63ac34953a0fb15ecee043253bf36fb6b1b4"/>
-      <w:r>
-        <w:t xml:space="preserve">Asking for namespaces</w:t>
+      <w:bookmarkStart w:id="20" w:name="_806e8f562219f1878eb78bde3d0e7edaa6e589f"/>
+      <w:r>
+        <w:t xml:space="preserve">New namespaces only</w:t>
       </w:r>
       <w:bookmarkEnd w:id="20"/>
     </w:p>
@@ -3141,7 +3097,72 @@
         </w:numPr>
       </w:pPr>
       <w:r>
-        <w:t xml:space="preserve">My namespace request gives my mnemonic, the same three letters as in the group names.</w:t>
+        <w:t xml:space="preserve">If my application's namespaces already exist, I skip this section: the groups and their members are all I</w:t>
+      </w:r>
+      <w:r>
+        <w:t xml:space="preserve"> </w:t>
+      </w:r>
+      <w:r>
+        <w:t xml:space="preserve">need. (</w:t>
+      </w:r>
+      <w:hyperlink w:anchor="_a7ee87f8ca21c9f7beb94ebcee9b501342447dc">
+        <w:r>
+          <w:rPr>
+            <w:rStyle w:val="Hyperlink"/>
+          </w:rPr>
+          <w:t xml:space="preserve">§5</w:t>
+        </w:r>
+      </w:hyperlink>
+      <w:r>
+        <w:t xml:space="preserve">)</w:t>
+      </w:r>
+    </w:p>
+    <w:p>
+      <w:pPr>
+        <w:pStyle w:val="Compact"/>
+        <w:numPr>
+          <w:ilvl w:val="0"/>
+          <w:numId w:val="1015"/>
+        </w:numPr>
+      </w:pPr>
+      <w:r>
+        <w:t xml:space="preserve">My namespace request states my target mnemonic, the same three letters as in the group names; the namespace</w:t>
+      </w:r>
+      <w:r>
+        <w:t xml:space="preserve"> </w:t>
+      </w:r>
+      <w:r>
+        <w:t xml:space="preserve">template sets the</w:t>
+      </w:r>
+      <w:r>
+        <w:t xml:space="preserve"> </w:t>
+      </w:r>
+      <w:r>
+        <w:rPr>
+          <w:rStyle w:val="VerbatimChar"/>
+        </w:rPr>
+        <w:t xml:space="preserve">company.net/mnemonic</w:t>
+      </w:r>
+      <w:r>
+        <w:t xml:space="preserve"> </w:t>
+      </w:r>
+      <w:r>
+        <w:t xml:space="preserve">and</w:t>
+      </w:r>
+      <w:r>
+        <w:t xml:space="preserve"> </w:t>
+      </w:r>
+      <w:r>
+        <w:rPr>
+          <w:rStyle w:val="VerbatimChar"/>
+        </w:rPr>
+        <w:t xml:space="preserve">company.net/app-environment</w:t>
+      </w:r>
+      <w:r>
+        <w:t xml:space="preserve"> </w:t>
+      </w:r>
+      <w:r>
+        <w:t xml:space="preserve">labels.</w:t>
       </w:r>
       <w:r>
         <w:t xml:space="preserve"> </w:t>
@@ -3177,122 +3198,6 @@
     </w:p>
     <w:p>
       <w:pPr>
-        <w:pStyle w:val="Compact"/>
-        <w:numPr>
-          <w:ilvl w:val="0"/>
-          <w:numId w:val="1015"/>
-        </w:numPr>
-      </w:pPr>
-      <w:r>
-        <w:t xml:space="preserve">It gives each namespace's environment as exactly</w:t>
-      </w:r>
-      <w:r>
-        <w:t xml:space="preserve"> </w:t>
-      </w:r>
-      <w:r>
-        <w:rPr>
-          <w:rStyle w:val="VerbatimChar"/>
-        </w:rPr>
-        <w:t xml:space="preserve">rnd</w:t>
-      </w:r>
-      <w:r>
-        <w:t xml:space="preserve">,</w:t>
-      </w:r>
-      <w:r>
-        <w:t xml:space="preserve"> </w:t>
-      </w:r>
-      <w:r>
-        <w:rPr>
-          <w:rStyle w:val="VerbatimChar"/>
-        </w:rPr>
-        <w:t xml:space="preserve">qa</w:t>
-      </w:r>
-      <w:r>
-        <w:t xml:space="preserve">,</w:t>
-      </w:r>
-      <w:r>
-        <w:t xml:space="preserve"> </w:t>
-      </w:r>
-      <w:r>
-        <w:rPr>
-          <w:rStyle w:val="VerbatimChar"/>
-        </w:rPr>
-        <w:t xml:space="preserve">uat</w:t>
-      </w:r>
-      <w:r>
-        <w:t xml:space="preserve"> </w:t>
-      </w:r>
-      <w:r>
-        <w:t xml:space="preserve">or</w:t>
-      </w:r>
-      <w:r>
-        <w:t xml:space="preserve"> </w:t>
-      </w:r>
-      <w:r>
-        <w:rPr>
-          <w:rStyle w:val="VerbatimChar"/>
-        </w:rPr>
-        <w:t xml:space="preserve">prod</w:t>
-      </w:r>
-      <w:r>
-        <w:t xml:space="preserve">; the namespace template turns</w:t>
-      </w:r>
-      <w:r>
-        <w:t xml:space="preserve"> </w:t>
-      </w:r>
-      <w:r>
-        <w:t xml:space="preserve">these into the</w:t>
-      </w:r>
-      <w:r>
-        <w:t xml:space="preserve"> </w:t>
-      </w:r>
-      <w:r>
-        <w:rPr>
-          <w:rStyle w:val="VerbatimChar"/>
-        </w:rPr>
-        <w:t xml:space="preserve">company.net/mnemonic</w:t>
-      </w:r>
-      <w:r>
-        <w:t xml:space="preserve"> </w:t>
-      </w:r>
-      <w:r>
-        <w:t xml:space="preserve">and</w:t>
-      </w:r>
-      <w:r>
-        <w:t xml:space="preserve"> </w:t>
-      </w:r>
-      <w:r>
-        <w:rPr>
-          <w:rStyle w:val="VerbatimChar"/>
-        </w:rPr>
-        <w:t xml:space="preserve">company.net/app-environment</w:t>
-      </w:r>
-      <w:r>
-        <w:t xml:space="preserve"> </w:t>
-      </w:r>
-      <w:r>
-        <w:t xml:space="preserve">labels.</w:t>
-      </w:r>
-      <w:r>
-        <w:t xml:space="preserve"> </w:t>
-      </w:r>
-      <w:r>
-        <w:t xml:space="preserve">(</w:t>
-      </w:r>
-      <w:hyperlink w:anchor="_a7ee87f8ca21c9f7beb94ebcee9b501342447dc">
-        <w:r>
-          <w:rPr>
-            <w:rStyle w:val="Hyperlink"/>
-          </w:rPr>
-          <w:t xml:space="preserve">§5</w:t>
-        </w:r>
-      </w:hyperlink>
-      <w:r>
-        <w:t xml:space="preserve">)</w:t>
-      </w:r>
-    </w:p>
-    <w:p>
-      <w:pPr>
         <w:pStyle w:val="Heading2"/>
       </w:pPr>
       <w:bookmarkStart w:id="21" w:name="_59e09b91ea0fcd4db92ec885cac713d44983e62"/>
@@ -3310,37 +3215,7 @@
         </w:numPr>
       </w:pPr>
       <w:r>
-        <w:t xml:space="preserve">Each namespace's page in the dashboard shows the</w:t>
-      </w:r>
-      <w:r>
-        <w:t xml:space="preserve"> </w:t>
-      </w:r>
-      <w:r>
-        <w:rPr>
-          <w:rStyle w:val="VerbatimChar"/>
-        </w:rPr>
-        <w:t xml:space="preserve">mnemonic</w:t>
-      </w:r>
-      <w:r>
-        <w:t xml:space="preserve"> </w:t>
-      </w:r>
-      <w:r>
-        <w:t xml:space="preserve">and</w:t>
-      </w:r>
-      <w:r>
-        <w:t xml:space="preserve"> </w:t>
-      </w:r>
-      <w:r>
-        <w:rPr>
-          <w:rStyle w:val="VerbatimChar"/>
-        </w:rPr>
-        <w:t xml:space="preserve">app-environment</w:t>
-      </w:r>
-      <w:r>
-        <w:t xml:space="preserve"> </w:t>
-      </w:r>
-      <w:r>
-        <w:t xml:space="preserve">I asked for.</w:t>
+        <w:t xml:space="preserve">Each namespace's page in the dashboard shows my mnemonic and the namespace's environment.</w:t>
       </w:r>
       <w:r>
         <w:t xml:space="preserve"> </w:t>

</xml_diff>

<commit_message>
docs: onboarding examples write the mnemonic as XYZ
The examples used the mnemonic pay, which reads like a real application.
They now write XYZ, which a reader replaces with their own three letters
in lowercase; the guide and checklist say so once, up front, with pay as
the worked example (app-ocp-rbac-XYZ-ns-audit is app-ocp-rbac-pay-ns-audit
for pay). Word lock files (~$*) are ignored.
</commit_message>
<xml_diff>
--- a/docs/ONBOARDING.docx
+++ b/docs/ONBOARDING.docx
@@ -172,7 +172,7 @@
         <w:t xml:space="preserve"> </w:t>
       </w:r>
       <w:r>
-        <w:t xml:space="preserve">their members are all you need. Every example below uses the mnemonic</w:t>
+        <w:t xml:space="preserve">their members are all you need. Every example below writes your mnemonic as</w:t>
       </w:r>
       <w:r>
         <w:t xml:space="preserve"> </w:t>
@@ -181,10 +181,49 @@
         <w:rPr>
           <w:rStyle w:val="VerbatimChar"/>
         </w:rPr>
+        <w:t xml:space="preserve">XYZ</w:t>
+      </w:r>
+      <w:r>
+        <w:t xml:space="preserve">: put your own three letters in its place, in lowercase (for the mnemonic</w:t>
+      </w:r>
+      <w:r>
+        <w:t xml:space="preserve"> </w:t>
+      </w:r>
+      <w:r>
+        <w:rPr>
+          <w:rStyle w:val="VerbatimChar"/>
+        </w:rPr>
         <w:t xml:space="preserve">pay</w:t>
       </w:r>
       <w:r>
-        <w:t xml:space="preserve">; use your own.</w:t>
+        <w:t xml:space="preserve">,</w:t>
+      </w:r>
+      <w:r>
+        <w:t xml:space="preserve"> </w:t>
+      </w:r>
+      <w:r>
+        <w:rPr>
+          <w:rStyle w:val="VerbatimChar"/>
+        </w:rPr>
+        <w:t xml:space="preserve">app-ocp-rbac-XYZ-ns-audit</w:t>
+      </w:r>
+      <w:r>
+        <w:t xml:space="preserve"> </w:t>
+      </w:r>
+      <w:r>
+        <w:t xml:space="preserve">is</w:t>
+      </w:r>
+      <w:r>
+        <w:t xml:space="preserve"> </w:t>
+      </w:r>
+      <w:r>
+        <w:rPr>
+          <w:rStyle w:val="VerbatimChar"/>
+        </w:rPr>
+        <w:t xml:space="preserve">app-ocp-rbac-pay-ns-audit</w:t>
+      </w:r>
+      <w:r>
+        <w:t xml:space="preserve">).</w:t>
       </w:r>
     </w:p>
     <w:p>
@@ -308,7 +347,7 @@
         <w:rPr>
           <w:rStyle w:val="VerbatimChar"/>
         </w:rPr>
-        <w:t xml:space="preserve">app-ocp-rbac-pay-ns-audit</w:t>
+        <w:t xml:space="preserve">app-ocp-rbac-XYZ-ns-audit</w:t>
       </w:r>
       <w:r>
         <w:t xml:space="preserve">, which lets its members look at what runs in the environment but</w:t>
@@ -369,7 +408,7 @@
         <w:rPr>
           <w:rStyle w:val="VerbatimChar"/>
         </w:rPr>
-        <w:t xml:space="preserve">app-ocp-rbac-pay-ns-developer</w:t>
+        <w:t xml:space="preserve">app-ocp-rbac-XYZ-ns-developer</w:t>
       </w:r>
       <w:r>
         <w:t xml:space="preserve">, which lets its members deploy and change things (OpenShift's</w:t>
@@ -450,7 +489,7 @@
               <w:rPr>
                 <w:rStyle w:val="VerbatimChar"/>
               </w:rPr>
-              <w:t xml:space="preserve">app-ocp-rbac-pay-ns-audit</w:t>
+              <w:t xml:space="preserve">app-ocp-rbac-XYZ-ns-audit</w:t>
             </w:r>
           </w:p>
         </w:tc>
@@ -536,7 +575,7 @@
               <w:rPr>
                 <w:rStyle w:val="VerbatimChar"/>
               </w:rPr>
-              <w:t xml:space="preserve">app-ocp-rbac-pay-ns-developer</w:t>
+              <w:t xml:space="preserve">app-ocp-rbac-XYZ-ns-developer</w:t>
             </w:r>
           </w:p>
         </w:tc>
@@ -903,7 +942,7 @@
               <w:rPr>
                 <w:rStyle w:val="VerbatimChar"/>
               </w:rPr>
-              <w:t xml:space="preserve">app-ocp-rbac-pay-ns-audit</w:t>
+              <w:t xml:space="preserve">app-ocp-rbac-XYZ-ns-audit</w:t>
             </w:r>
             <w:r>
               <w:t xml:space="preserve">,</w:t>
@@ -915,7 +954,7 @@
               <w:rPr>
                 <w:rStyle w:val="VerbatimChar"/>
               </w:rPr>
-              <w:t xml:space="preserve">app-ocp-rbac-pay-ns-developer</w:t>
+              <w:t xml:space="preserve">app-ocp-rbac-XYZ-ns-developer</w:t>
             </w:r>
           </w:p>
         </w:tc>
@@ -945,7 +984,7 @@
               <w:rPr>
                 <w:rStyle w:val="VerbatimChar"/>
               </w:rPr>
-              <w:t xml:space="preserve">app-ocp-rbac-pay-ns-audit</w:t>
+              <w:t xml:space="preserve">app-ocp-rbac-XYZ-ns-audit</w:t>
             </w:r>
             <w:r>
               <w:t xml:space="preserve">,</w:t>
@@ -957,7 +996,7 @@
               <w:rPr>
                 <w:rStyle w:val="VerbatimChar"/>
               </w:rPr>
-              <w:t xml:space="preserve">app-ocp-rbac-pay-ns-developer</w:t>
+              <w:t xml:space="preserve">app-ocp-rbac-XYZ-ns-developer</w:t>
             </w:r>
           </w:p>
         </w:tc>
@@ -987,7 +1026,7 @@
               <w:rPr>
                 <w:rStyle w:val="VerbatimChar"/>
               </w:rPr>
-              <w:t xml:space="preserve">app-ocp-rbac-pay-ns-audit</w:t>
+              <w:t xml:space="preserve">app-ocp-rbac-XYZ-ns-audit</w:t>
             </w:r>
             <w:r>
               <w:t xml:space="preserve">,</w:t>
@@ -999,7 +1038,7 @@
               <w:rPr>
                 <w:rStyle w:val="VerbatimChar"/>
               </w:rPr>
-              <w:t xml:space="preserve">app-ocp-rbac-pay-ns-developer</w:t>
+              <w:t xml:space="preserve">app-ocp-rbac-XYZ-ns-developer</w:t>
             </w:r>
           </w:p>
         </w:tc>
@@ -1029,7 +1068,7 @@
               <w:rPr>
                 <w:rStyle w:val="VerbatimChar"/>
               </w:rPr>
-              <w:t xml:space="preserve">app-ocp-rbac-pay-ns-audit</w:t>
+              <w:t xml:space="preserve">app-ocp-rbac-XYZ-ns-audit</w:t>
             </w:r>
             <w:r>
               <w:t xml:space="preserve"> </w:t>
@@ -1049,7 +1088,7 @@
         <w:rPr>
           <w:rStyle w:val="VerbatimChar"/>
         </w:rPr>
-        <w:t xml:space="preserve">app-ocp-rbac-pay-ns-audit</w:t>
+        <w:t xml:space="preserve">app-ocp-rbac-XYZ-ns-audit</w:t>
       </w:r>
       <w:r>
         <w:br/>
@@ -1058,7 +1097,7 @@
         <w:rPr>
           <w:rStyle w:val="VerbatimChar"/>
         </w:rPr>
-        <w:t xml:space="preserve">app-ocp-rbac-pay-ns-developer</w:t>
+        <w:t xml:space="preserve">app-ocp-rbac-XYZ-ns-developer</w:t>
       </w:r>
     </w:p>
     <w:p>
@@ -1259,7 +1298,7 @@
         <w:rPr>
           <w:rStyle w:val="VerbatimChar"/>
         </w:rPr>
-        <w:t xml:space="preserve">app-ocp-rbac-pay-</w:t>
+        <w:t xml:space="preserve">app-ocp-rbac-XYZ-</w:t>
       </w:r>
       <w:r>
         <w:t xml:space="preserve"> </w:t>
@@ -1483,7 +1522,7 @@
         <w:rPr>
           <w:rStyle w:val="AttributeTok"/>
         </w:rPr>
-        <w:t xml:space="preserve"> pay          # your target mnemonic, as stated in the request</w:t>
+        <w:t xml:space="preserve"> XYZ          # your target mnemonic, as stated in the request</w:t>
       </w:r>
       <w:r>
         <w:br/>
@@ -1599,7 +1638,7 @@
               <w:rPr>
                 <w:rStyle w:val="VerbatimChar"/>
               </w:rPr>
-              <w:t xml:space="preserve">pay-rnd</w:t>
+              <w:t xml:space="preserve">XYZ-rnd</w:t>
             </w:r>
           </w:p>
         </w:tc>
@@ -1613,7 +1652,7 @@
               <w:rPr>
                 <w:rStyle w:val="VerbatimChar"/>
               </w:rPr>
-              <w:t xml:space="preserve">pay</w:t>
+              <w:t xml:space="preserve">XYZ</w:t>
             </w:r>
           </w:p>
         </w:tc>
@@ -1643,7 +1682,7 @@
               <w:rPr>
                 <w:rStyle w:val="VerbatimChar"/>
               </w:rPr>
-              <w:t xml:space="preserve">pay-qa</w:t>
+              <w:t xml:space="preserve">XYZ-qa</w:t>
             </w:r>
           </w:p>
         </w:tc>
@@ -1657,7 +1696,7 @@
               <w:rPr>
                 <w:rStyle w:val="VerbatimChar"/>
               </w:rPr>
-              <w:t xml:space="preserve">pay</w:t>
+              <w:t xml:space="preserve">XYZ</w:t>
             </w:r>
           </w:p>
         </w:tc>
@@ -1687,7 +1726,7 @@
               <w:rPr>
                 <w:rStyle w:val="VerbatimChar"/>
               </w:rPr>
-              <w:t xml:space="preserve">pay-uat</w:t>
+              <w:t xml:space="preserve">XYZ-uat</w:t>
             </w:r>
           </w:p>
         </w:tc>
@@ -1701,7 +1740,7 @@
               <w:rPr>
                 <w:rStyle w:val="VerbatimChar"/>
               </w:rPr>
-              <w:t xml:space="preserve">pay</w:t>
+              <w:t xml:space="preserve">XYZ</w:t>
             </w:r>
           </w:p>
         </w:tc>
@@ -1731,7 +1770,7 @@
               <w:rPr>
                 <w:rStyle w:val="VerbatimChar"/>
               </w:rPr>
-              <w:t xml:space="preserve">pay-prod</w:t>
+              <w:t xml:space="preserve">XYZ-prod</w:t>
             </w:r>
           </w:p>
         </w:tc>
@@ -1745,7 +1784,7 @@
               <w:rPr>
                 <w:rStyle w:val="VerbatimChar"/>
               </w:rPr>
-              <w:t xml:space="preserve">pay</w:t>
+              <w:t xml:space="preserve">XYZ</w:t>
             </w:r>
           </w:p>
         </w:tc>
@@ -1973,13 +2012,13 @@
         <w:rPr>
           <w:rStyle w:val="NormalTok"/>
         </w:rPr>
-        <w:t xml:space="preserve"> pay-rnd   </w:t>
+        <w:t xml:space="preserve"> XYZ-rnd   </w:t>
       </w:r>
       <w:r>
         <w:rPr>
           <w:rStyle w:val="CommentTok"/>
         </w:rPr>
-        <w:t xml:space="preserve"># yes, if you are in app-ocp-rbac-pay-ns-developer in the rnd directory</w:t>
+        <w:t xml:space="preserve"># yes, if you are in app-ocp-rbac-XYZ-ns-developer in the rnd directory</w:t>
       </w:r>
       <w:r>
         <w:br/>
@@ -2006,13 +2045,13 @@
         <w:rPr>
           <w:rStyle w:val="NormalTok"/>
         </w:rPr>
-        <w:t xml:space="preserve"> pay-prod            </w:t>
+        <w:t xml:space="preserve"> XYZ-prod            </w:t>
       </w:r>
       <w:r>
         <w:rPr>
           <w:rStyle w:val="CommentTok"/>
         </w:rPr>
-        <w:t xml:space="preserve"># yes, if you are in app-ocp-rbac-pay-ns-audit in the prod directory</w:t>
+        <w:t xml:space="preserve"># yes, if you are in app-ocp-rbac-XYZ-ns-audit in the prod directory</w:t>
       </w:r>
       <w:r>
         <w:br/>
@@ -2039,7 +2078,7 @@
         <w:rPr>
           <w:rStyle w:val="NormalTok"/>
         </w:rPr>
-        <w:t xml:space="preserve"> pay-prod  </w:t>
+        <w:t xml:space="preserve"> XYZ-prod  </w:t>
       </w:r>
       <w:r>
         <w:rPr>
@@ -2712,7 +2751,7 @@
         <w:t xml:space="preserve"> </w:t>
       </w:r>
       <w:r>
-        <w:t xml:space="preserve">use the mnemonic</w:t>
+        <w:t xml:space="preserve">write your mnemonic as</w:t>
       </w:r>
       <w:r>
         <w:t xml:space="preserve"> </w:t>
@@ -2721,10 +2760,10 @@
         <w:rPr>
           <w:rStyle w:val="VerbatimChar"/>
         </w:rPr>
-        <w:t xml:space="preserve">pay</w:t>
-      </w:r>
-      <w:r>
-        <w:t xml:space="preserve">; use your own.</w:t>
+        <w:t xml:space="preserve">XYZ</w:t>
+      </w:r>
+      <w:r>
+        <w:t xml:space="preserve">: put your own three letters in its place, in lowercase.</w:t>
       </w:r>
     </w:p>
     <w:p>
@@ -2807,7 +2846,7 @@
         <w:rPr>
           <w:rStyle w:val="VerbatimChar"/>
         </w:rPr>
-        <w:t xml:space="preserve">app-ocp-rbac-&lt;mnemonic&gt;-ns-audit</w:t>
+        <w:t xml:space="preserve">app-ocp-rbac-XYZ-ns-audit</w:t>
       </w:r>
       <w:r>
         <w:t xml:space="preserve"> </w:t>
@@ -2913,7 +2952,7 @@
         <w:rPr>
           <w:rStyle w:val="VerbatimChar"/>
         </w:rPr>
-        <w:t xml:space="preserve">app-ocp-rbac-&lt;mnemonic&gt;-ns-developer</w:t>
+        <w:t xml:space="preserve">app-ocp-rbac-XYZ-ns-developer</w:t>
       </w:r>
       <w:r>
         <w:t xml:space="preserve"> </w:t>

</xml_diff>

<commit_message>
docs: onboarding uses XYZ everywhere, labels in lowercase
The last two uses of pay become XYZ, and the guide says the capitals are
only for illustration: a mnemonic is lowercase wherever it is used, so
app-ocp-rbac-XYZ-ns-audit is the group app-ocp-rbac-xyz-ns-audit and the
namespace carries company.net/mnemonic: xyz. The label example and the
namespace table show the lowercase value the metadata really holds.
</commit_message>
<xml_diff>
--- a/docs/ONBOARDING.docx
+++ b/docs/ONBOARDING.docx
@@ -184,19 +184,7 @@
         <w:t xml:space="preserve">XYZ</w:t>
       </w:r>
       <w:r>
-        <w:t xml:space="preserve">: put your own three letters in its place, in lowercase (for the mnemonic</w:t>
-      </w:r>
-      <w:r>
-        <w:t xml:space="preserve"> </w:t>
-      </w:r>
-      <w:r>
-        <w:rPr>
-          <w:rStyle w:val="VerbatimChar"/>
-        </w:rPr>
-        <w:t xml:space="preserve">pay</w:t>
-      </w:r>
-      <w:r>
-        <w:t xml:space="preserve">,</w:t>
+        <w:t xml:space="preserve">. The capitals are only for illustration: a real mnemonic is three lowercase letters, and it is lowercase everywhere it is used, so</w:t>
       </w:r>
       <w:r>
         <w:t xml:space="preserve"> </w:t>
@@ -211,19 +199,34 @@
         <w:t xml:space="preserve"> </w:t>
       </w:r>
       <w:r>
-        <w:t xml:space="preserve">is</w:t>
-      </w:r>
-      <w:r>
-        <w:t xml:space="preserve"> </w:t>
-      </w:r>
-      <w:r>
-        <w:rPr>
-          <w:rStyle w:val="VerbatimChar"/>
-        </w:rPr>
-        <w:t xml:space="preserve">app-ocp-rbac-pay-ns-audit</w:t>
-      </w:r>
-      <w:r>
-        <w:t xml:space="preserve">).</w:t>
+        <w:t xml:space="preserve">is the group</w:t>
+      </w:r>
+      <w:r>
+        <w:t xml:space="preserve"> </w:t>
+      </w:r>
+      <w:r>
+        <w:rPr>
+          <w:rStyle w:val="VerbatimChar"/>
+        </w:rPr>
+        <w:t xml:space="preserve">app-ocp-rbac-xyz-ns-audit</w:t>
+      </w:r>
+      <w:r>
+        <w:t xml:space="preserve"> </w:t>
+      </w:r>
+      <w:r>
+        <w:t xml:space="preserve">and a namespace carries</w:t>
+      </w:r>
+      <w:r>
+        <w:t xml:space="preserve"> </w:t>
+      </w:r>
+      <w:r>
+        <w:rPr>
+          <w:rStyle w:val="VerbatimChar"/>
+        </w:rPr>
+        <w:t xml:space="preserve">company.net/mnemonic: xyz</w:t>
+      </w:r>
+      <w:r>
+        <w:t xml:space="preserve">.</w:t>
       </w:r>
     </w:p>
     <w:p>
@@ -764,19 +767,34 @@
         <w:t xml:space="preserve"> </w:t>
       </w:r>
       <w:r>
-        <w:t xml:space="preserve">Three lowercase letters assigned to your application, such as</w:t>
-      </w:r>
-      <w:r>
-        <w:t xml:space="preserve"> </w:t>
-      </w:r>
-      <w:r>
-        <w:rPr>
-          <w:rStyle w:val="VerbatimChar"/>
-        </w:rPr>
-        <w:t xml:space="preserve">pay</w:t>
-      </w:r>
-      <w:r>
-        <w:t xml:space="preserve">. If you do not know it, ask</w:t>
+        <w:t xml:space="preserve">Three lowercase letters assigned to your application (</w:t>
+      </w:r>
+      <w:r>
+        <w:rPr>
+          <w:rStyle w:val="VerbatimChar"/>
+        </w:rPr>
+        <w:t xml:space="preserve">XYZ</w:t>
+      </w:r>
+      <w:r>
+        <w:t xml:space="preserve"> </w:t>
+      </w:r>
+      <w:r>
+        <w:t xml:space="preserve">in this guide,</w:t>
+      </w:r>
+      <w:r>
+        <w:t xml:space="preserve"> </w:t>
+      </w:r>
+      <w:r>
+        <w:rPr>
+          <w:rStyle w:val="VerbatimChar"/>
+        </w:rPr>
+        <w:t xml:space="preserve">xyz</w:t>
+      </w:r>
+      <w:r>
+        <w:t xml:space="preserve"> </w:t>
+      </w:r>
+      <w:r>
+        <w:t xml:space="preserve">as it is really written). If you do not know it, ask</w:t>
       </w:r>
       <w:r>
         <w:t xml:space="preserve"> </w:t>
@@ -1522,7 +1540,7 @@
         <w:rPr>
           <w:rStyle w:val="AttributeTok"/>
         </w:rPr>
-        <w:t xml:space="preserve"> XYZ          # your target mnemonic, as stated in the request</w:t>
+        <w:t xml:space="preserve"> xyz          # your target mnemonic, lowercase, as stated in the request</w:t>
       </w:r>
       <w:r>
         <w:br/>
@@ -1638,7 +1656,7 @@
               <w:rPr>
                 <w:rStyle w:val="VerbatimChar"/>
               </w:rPr>
-              <w:t xml:space="preserve">XYZ-rnd</w:t>
+              <w:t xml:space="preserve">xyz-rnd</w:t>
             </w:r>
           </w:p>
         </w:tc>
@@ -1652,7 +1670,7 @@
               <w:rPr>
                 <w:rStyle w:val="VerbatimChar"/>
               </w:rPr>
-              <w:t xml:space="preserve">XYZ</w:t>
+              <w:t xml:space="preserve">xyz</w:t>
             </w:r>
           </w:p>
         </w:tc>
@@ -1682,7 +1700,7 @@
               <w:rPr>
                 <w:rStyle w:val="VerbatimChar"/>
               </w:rPr>
-              <w:t xml:space="preserve">XYZ-qa</w:t>
+              <w:t xml:space="preserve">xyz-qa</w:t>
             </w:r>
           </w:p>
         </w:tc>
@@ -1696,7 +1714,7 @@
               <w:rPr>
                 <w:rStyle w:val="VerbatimChar"/>
               </w:rPr>
-              <w:t xml:space="preserve">XYZ</w:t>
+              <w:t xml:space="preserve">xyz</w:t>
             </w:r>
           </w:p>
         </w:tc>
@@ -1726,7 +1744,7 @@
               <w:rPr>
                 <w:rStyle w:val="VerbatimChar"/>
               </w:rPr>
-              <w:t xml:space="preserve">XYZ-uat</w:t>
+              <w:t xml:space="preserve">xyz-uat</w:t>
             </w:r>
           </w:p>
         </w:tc>
@@ -1740,7 +1758,7 @@
               <w:rPr>
                 <w:rStyle w:val="VerbatimChar"/>
               </w:rPr>
-              <w:t xml:space="preserve">XYZ</w:t>
+              <w:t xml:space="preserve">xyz</w:t>
             </w:r>
           </w:p>
         </w:tc>
@@ -1770,7 +1788,7 @@
               <w:rPr>
                 <w:rStyle w:val="VerbatimChar"/>
               </w:rPr>
-              <w:t xml:space="preserve">XYZ-prod</w:t>
+              <w:t xml:space="preserve">xyz-prod</w:t>
             </w:r>
           </w:p>
         </w:tc>
@@ -1784,7 +1802,7 @@
               <w:rPr>
                 <w:rStyle w:val="VerbatimChar"/>
               </w:rPr>
-              <w:t xml:space="preserve">XYZ</w:t>
+              <w:t xml:space="preserve">xyz</w:t>
             </w:r>
           </w:p>
         </w:tc>
@@ -2785,19 +2803,34 @@
         </w:numPr>
       </w:pPr>
       <w:r>
-        <w:t xml:space="preserve">I know my application's mnemonic: three lowercase letters, such as</w:t>
-      </w:r>
-      <w:r>
-        <w:t xml:space="preserve"> </w:t>
-      </w:r>
-      <w:r>
-        <w:rPr>
-          <w:rStyle w:val="VerbatimChar"/>
-        </w:rPr>
-        <w:t xml:space="preserve">pay</w:t>
-      </w:r>
-      <w:r>
-        <w:t xml:space="preserve">. (</w:t>
+        <w:t xml:space="preserve">I know my application's mnemonic: three lowercase letters (</w:t>
+      </w:r>
+      <w:r>
+        <w:rPr>
+          <w:rStyle w:val="VerbatimChar"/>
+        </w:rPr>
+        <w:t xml:space="preserve">XYZ</w:t>
+      </w:r>
+      <w:r>
+        <w:t xml:space="preserve"> </w:t>
+      </w:r>
+      <w:r>
+        <w:t xml:space="preserve">in these examples,</w:t>
+      </w:r>
+      <w:r>
+        <w:t xml:space="preserve"> </w:t>
+      </w:r>
+      <w:r>
+        <w:rPr>
+          <w:rStyle w:val="VerbatimChar"/>
+        </w:rPr>
+        <w:t xml:space="preserve">xyz</w:t>
+      </w:r>
+      <w:r>
+        <w:t xml:space="preserve"> </w:t>
+      </w:r>
+      <w:r>
+        <w:t xml:space="preserve">as it is really written). (</w:t>
       </w:r>
       <w:hyperlink w:anchor="_38acef848ce29405352518279f38563d145ffea">
         <w:r>

</xml_diff>